<commit_message>
Add nightly local DOE agent artifacts
</commit_message>
<xml_diff>
--- a/agent-outputs/hypothetical-local-agent-suite/final/chief-of-staff-agent/schedule-optimizer/weekly-time-plan.docx
+++ b/agent-outputs/hypothetical-local-agent-suite/final/chief-of-staff-agent/schedule-optimizer/weekly-time-plan.docx
@@ -372,6 +372,52 @@
           <w:p>
             <w:r>
               <w:rPr/>
+              <w:t>Thursday</w:t>
+            </w:r>
+          </w:p>
+        </w:tc>
+        <w:tc>
+          <w:tcPr>
+            <w:tcW w:w="2400" w:type="dxa"/>
+          </w:tcPr>
+          <w:p>
+            <w:r>
+              <w:rPr/>
+              <w:t>08:45 - 11:15</w:t>
+            </w:r>
+          </w:p>
+        </w:tc>
+        <w:tc>
+          <w:tcPr>
+            <w:tcW w:w="2400" w:type="dxa"/>
+          </w:tcPr>
+          <w:p>
+            <w:r>
+              <w:rPr/>
+              <w:t>Experiment and validation</w:t>
+            </w:r>
+          </w:p>
+        </w:tc>
+        <w:tc>
+          <w:tcPr>
+            <w:tcW w:w="2400" w:type="dxa"/>
+          </w:tcPr>
+          <w:p>
+            <w:r>
+              <w:rPr/>
+              <w:t>Batch local model and artifact experiments while working memory is fresh.</w:t>
+            </w:r>
+          </w:p>
+        </w:tc>
+      </w:tr>
+      <w:tr>
+        <w:tc>
+          <w:tcPr>
+            <w:tcW w:w="2400" w:type="dxa"/>
+          </w:tcPr>
+          <w:p>
+            <w:r>
+              <w:rPr/>
               <w:t>Tuesday</w:t>
             </w:r>
           </w:p>
@@ -452,52 +498,6 @@
             <w:r>
               <w:rPr/>
               <w:t>Protect your strength in synthesizing systems before the design direction meeting.</w:t>
-            </w:r>
-          </w:p>
-        </w:tc>
-      </w:tr>
-      <w:tr>
-        <w:tc>
-          <w:tcPr>
-            <w:tcW w:w="2400" w:type="dxa"/>
-          </w:tcPr>
-          <w:p>
-            <w:r>
-              <w:rPr/>
-              <w:t>Thursday</w:t>
-            </w:r>
-          </w:p>
-        </w:tc>
-        <w:tc>
-          <w:tcPr>
-            <w:tcW w:w="2400" w:type="dxa"/>
-          </w:tcPr>
-          <w:p>
-            <w:r>
-              <w:rPr/>
-              <w:t>08:45 - 11:15</w:t>
-            </w:r>
-          </w:p>
-        </w:tc>
-        <w:tc>
-          <w:tcPr>
-            <w:tcW w:w="2400" w:type="dxa"/>
-          </w:tcPr>
-          <w:p>
-            <w:r>
-              <w:rPr/>
-              <w:t>Experiment and validation</w:t>
-            </w:r>
-          </w:p>
-        </w:tc>
-        <w:tc>
-          <w:tcPr>
-            <w:tcW w:w="2400" w:type="dxa"/>
-          </w:tcPr>
-          <w:p>
-            <w:r>
-              <w:rPr/>
-              <w:t>Batch local model and artifact experiments while working memory is fresh.</w:t>
             </w:r>
           </w:p>
         </w:tc>
@@ -784,18 +784,18 @@
           <w:p>
             <w:r>
               <w:rPr/>
-              <w:t>A weekly learning review will let the system improve without silently rewriting preferences.</w:t>
-            </w:r>
-          </w:p>
-        </w:tc>
-        <w:tc>
-          <w:tcPr>
-            <w:tcW w:w="2400" w:type="dxa"/>
-          </w:tcPr>
-          <w:p>
-            <w:r>
-              <w:rPr/>
-              <w:t>Learning review creates an explicit promotion gate for future schedule defaults.</w:t>
+              <w:t>A focus schedule strategy will improve output quality without silently rewriting preferences.</w:t>
+            </w:r>
+          </w:p>
+        </w:tc>
+        <w:tc>
+          <w:tcPr>
+            <w:tcW w:w="2400" w:type="dxa"/>
+          </w:tcPr>
+          <w:p>
+            <w:r>
+              <w:rPr/>
+              <w:t>Learning review creates an explicit promotion gate for future schedule defaults and strategy selection.</w:t>
             </w:r>
           </w:p>
         </w:tc>

</xml_diff>